<commit_message>
Geschichte 11: Gruppenpuzzle mit getrennten Lösungskarten und stummem Schaubild als Sicherung
Co-Authored-By: Claude Opus 5.5 <noreply@anthropic.com>
Claude-Session: https://claude.ai/code/session_013iN4Tiarea1J9YUJHZ9iqC
</commit_message>
<xml_diff>
--- a/Geschichte_11/Stunde_Solon_Gruppenpuzzle/Handreichung_Geld_statt_Blut.docx
+++ b/Geschichte_11/Stunde_Solon_Gruppenpuzzle/Handreichung_Geld_statt_Blut.docx
@@ -265,7 +265,7 @@
                 <w:sz w:val="18"/>
                 <w:szCs w:val="18"/>
               </w:rPr>
-              <w:t xml:space="preserve">Faltkarten, Seite 1 (A–D)</w:t>
+              <w:t xml:space="preserve">Anfragekarten, Seite 1 (A–D)</w:t>
             </w:r>
           </w:p>
           <w:p>
@@ -277,7 +277,7 @@
                 <w:sz w:val="18"/>
                 <w:szCs w:val="18"/>
               </w:rPr>
-              <w:t xml:space="preserve">Faltkarten_Gruppenpuzzle.docx</w:t>
+              <w:t xml:space="preserve">Anfragekarten_Gruppenpuzzle.docx</w:t>
             </w:r>
           </w:p>
         </w:tc>
@@ -335,7 +335,7 @@
                 <w:sz w:val="18"/>
                 <w:szCs w:val="18"/>
               </w:rPr>
-              <w:t xml:space="preserve">An den Außenlinien in 4 Karten schneiden. Jede Karte an der gestrichelten Linie nach hinten knicken, sodass die Lösung verdeckt ist.</w:t>
+              <w:t xml:space="preserve">In 4 Karten schneiden. Nur die Anfrage, keine Lösung.</w:t>
             </w:r>
           </w:p>
         </w:tc>
@@ -371,7 +371,7 @@
                 <w:sz w:val="18"/>
                 <w:szCs w:val="18"/>
               </w:rPr>
-              <w:t xml:space="preserve">Faltkarten, Seite 2 (E)</w:t>
+              <w:t xml:space="preserve">Anfragekarten, Seite 2 (E)</w:t>
             </w:r>
           </w:p>
           <w:p>
@@ -441,7 +441,219 @@
                 <w:sz w:val="18"/>
                 <w:szCs w:val="18"/>
               </w:rPr>
-              <w:t xml:space="preserve">Enthält vier Karten E.</w:t>
+              <w:t xml:space="preserve">Vier Karten E.</w:t>
+            </w:r>
+          </w:p>
+        </w:tc>
+      </w:tr>
+      <w:tr>
+        <w:trPr>
+          <w:cantSplit/>
+        </w:trPr>
+        <w:tc>
+          <w:tcPr>
+            <w:tcW w:type="dxa" w:w="3200"/>
+            <w:tcBorders>
+              <w:top w:val="single" w:color="BFB5A5" w:sz="4"/>
+              <w:left w:val="single" w:color="BFB5A5" w:sz="4"/>
+              <w:bottom w:val="single" w:color="BFB5A5" w:sz="4"/>
+              <w:right w:val="single" w:color="BFB5A5" w:sz="4"/>
+            </w:tcBorders>
+            <w:tcMar>
+              <w:top w:type="dxa" w:w="70"/>
+              <w:left w:type="dxa" w:w="100"/>
+              <w:bottom w:type="dxa" w:w="70"/>
+              <w:right w:type="dxa" w:w="100"/>
+            </w:tcMar>
+          </w:tcPr>
+          <w:p>
+            <w:pPr>
+              <w:spacing w:after="30" w:before="0"/>
+            </w:pPr>
+            <w:r>
+              <w:rPr>
+                <w:b/>
+                <w:bCs/>
+                <w:sz w:val="18"/>
+                <w:szCs w:val="18"/>
+              </w:rPr>
+              <w:t xml:space="preserve">Lösungskarten, Seite 1 (A–D)</w:t>
+            </w:r>
+          </w:p>
+          <w:p>
+            <w:pPr>
+              <w:spacing w:after="30" w:before="0"/>
+            </w:pPr>
+            <w:r>
+              <w:rPr>
+                <w:sz w:val="18"/>
+                <w:szCs w:val="18"/>
+              </w:rPr>
+              <w:t xml:space="preserve">Loesungskarten_Gruppenpuzzle.docx</w:t>
+            </w:r>
+          </w:p>
+        </w:tc>
+        <w:tc>
+          <w:tcPr>
+            <w:tcW w:type="dxa" w:w="2300"/>
+            <w:tcBorders>
+              <w:top w:val="single" w:color="BFB5A5" w:sz="4"/>
+              <w:left w:val="single" w:color="BFB5A5" w:sz="4"/>
+              <w:bottom w:val="single" w:color="BFB5A5" w:sz="4"/>
+              <w:right w:val="single" w:color="BFB5A5" w:sz="4"/>
+            </w:tcBorders>
+            <w:tcMar>
+              <w:top w:type="dxa" w:w="70"/>
+              <w:left w:type="dxa" w:w="100"/>
+              <w:bottom w:type="dxa" w:w="70"/>
+              <w:right w:type="dxa" w:w="100"/>
+            </w:tcMar>
+          </w:tcPr>
+          <w:p>
+            <w:pPr>
+              <w:spacing w:after="0" w:before="0"/>
+            </w:pPr>
+            <w:r>
+              <w:rPr>
+                <w:sz w:val="18"/>
+                <w:szCs w:val="18"/>
+              </w:rPr>
+              <w:t xml:space="preserve">2 ×</w:t>
+            </w:r>
+          </w:p>
+        </w:tc>
+        <w:tc>
+          <w:tcPr>
+            <w:tcW w:type="dxa" w:w="4138"/>
+            <w:tcBorders>
+              <w:top w:val="single" w:color="BFB5A5" w:sz="4"/>
+              <w:left w:val="single" w:color="BFB5A5" w:sz="4"/>
+              <w:bottom w:val="single" w:color="BFB5A5" w:sz="4"/>
+              <w:right w:val="single" w:color="BFB5A5" w:sz="4"/>
+            </w:tcBorders>
+            <w:tcMar>
+              <w:top w:type="dxa" w:w="70"/>
+              <w:left w:type="dxa" w:w="100"/>
+              <w:bottom w:type="dxa" w:w="70"/>
+              <w:right w:type="dxa" w:w="100"/>
+            </w:tcMar>
+          </w:tcPr>
+          <w:p>
+            <w:pPr>
+              <w:spacing w:after="0" w:before="0"/>
+            </w:pPr>
+            <w:r>
+              <w:rPr>
+                <w:sz w:val="18"/>
+                <w:szCs w:val="18"/>
+              </w:rPr>
+              <w:t xml:space="preserve">Bleiben bei dir am Pult. Pro Buchstabe gibt es meist zwei Expertengruppen. Seite 2 (E) nur bei 5er-Gruppen.</w:t>
+            </w:r>
+          </w:p>
+        </w:tc>
+      </w:tr>
+      <w:tr>
+        <w:trPr>
+          <w:cantSplit/>
+        </w:trPr>
+        <w:tc>
+          <w:tcPr>
+            <w:tcW w:type="dxa" w:w="3200"/>
+            <w:tcBorders>
+              <w:top w:val="single" w:color="BFB5A5" w:sz="4"/>
+              <w:left w:val="single" w:color="BFB5A5" w:sz="4"/>
+              <w:bottom w:val="single" w:color="BFB5A5" w:sz="4"/>
+              <w:right w:val="single" w:color="BFB5A5" w:sz="4"/>
+            </w:tcBorders>
+            <w:tcMar>
+              <w:top w:type="dxa" w:w="70"/>
+              <w:left w:type="dxa" w:w="100"/>
+              <w:bottom w:type="dxa" w:w="70"/>
+              <w:right w:type="dxa" w:w="100"/>
+            </w:tcMar>
+          </w:tcPr>
+          <w:p>
+            <w:pPr>
+              <w:spacing w:after="30" w:before="0"/>
+            </w:pPr>
+            <w:r>
+              <w:rPr>
+                <w:b/>
+                <w:bCs/>
+                <w:sz w:val="18"/>
+                <w:szCs w:val="18"/>
+              </w:rPr>
+              <w:t xml:space="preserve">Stummes Schaubild</w:t>
+            </w:r>
+          </w:p>
+          <w:p>
+            <w:pPr>
+              <w:spacing w:after="30" w:before="0"/>
+            </w:pPr>
+            <w:r>
+              <w:rPr>
+                <w:sz w:val="18"/>
+                <w:szCs w:val="18"/>
+              </w:rPr>
+              <w:t xml:space="preserve">Stummes_Schaubild_A5.docx</w:t>
+            </w:r>
+          </w:p>
+        </w:tc>
+        <w:tc>
+          <w:tcPr>
+            <w:tcW w:type="dxa" w:w="2300"/>
+            <w:tcBorders>
+              <w:top w:val="single" w:color="BFB5A5" w:sz="4"/>
+              <w:left w:val="single" w:color="BFB5A5" w:sz="4"/>
+              <w:bottom w:val="single" w:color="BFB5A5" w:sz="4"/>
+              <w:right w:val="single" w:color="BFB5A5" w:sz="4"/>
+            </w:tcBorders>
+            <w:tcMar>
+              <w:top w:type="dxa" w:w="70"/>
+              <w:left w:type="dxa" w:w="100"/>
+              <w:bottom w:type="dxa" w:w="70"/>
+              <w:right w:type="dxa" w:w="100"/>
+            </w:tcMar>
+          </w:tcPr>
+          <w:p>
+            <w:pPr>
+              <w:spacing w:after="0" w:before="0"/>
+            </w:pPr>
+            <w:r>
+              <w:rPr>
+                <w:sz w:val="18"/>
+                <w:szCs w:val="18"/>
+              </w:rPr>
+              <w:t xml:space="preserve">halb so viele Blätter wie Schüler</w:t>
+            </w:r>
+          </w:p>
+        </w:tc>
+        <w:tc>
+          <w:tcPr>
+            <w:tcW w:type="dxa" w:w="4138"/>
+            <w:tcBorders>
+              <w:top w:val="single" w:color="BFB5A5" w:sz="4"/>
+              <w:left w:val="single" w:color="BFB5A5" w:sz="4"/>
+              <w:bottom w:val="single" w:color="BFB5A5" w:sz="4"/>
+              <w:right w:val="single" w:color="BFB5A5" w:sz="4"/>
+            </w:tcBorders>
+            <w:tcMar>
+              <w:top w:type="dxa" w:w="70"/>
+              <w:left w:type="dxa" w:w="100"/>
+              <w:bottom w:type="dxa" w:w="70"/>
+              <w:right w:type="dxa" w:w="100"/>
+            </w:tcMar>
+          </w:tcPr>
+          <w:p>
+            <w:pPr>
+              <w:spacing w:after="0" w:before="0"/>
+            </w:pPr>
+            <w:r>
+              <w:rPr>
+                <w:sz w:val="18"/>
+                <w:szCs w:val="18"/>
+              </w:rPr>
+              <w:t xml:space="preserve">A4 quer, 2 Exemplare pro Blatt, in der Mitte schneiden.</w:t>
             </w:r>
           </w:p>
         </w:tc>
@@ -612,7 +824,7 @@
           <w:sz w:val="20"/>
           <w:szCs w:val="20"/>
         </w:rPr>
-        <w:t xml:space="preserve">☐  Faltkarten schneiden und knicken, je Stammgruppe einen Satz A–D (plus E) bündeln.</w:t>
+        <w:t xml:space="preserve">☐  Anfragekarten schneiden, je Stammgruppe einen Satz A–D (plus E) bündeln. Lösungskarten nach Buchstaben sortiert ans Pult legen. Stumme Schaubilder schneiden.</w:t>
       </w:r>
     </w:p>
     <w:p>
@@ -1177,7 +1389,7 @@
                 <w:sz w:val="18"/>
                 <w:szCs w:val="18"/>
               </w:rPr>
-              <w:t xml:space="preserve">7–8</w:t>
+              <w:t xml:space="preserve">7</w:t>
             </w:r>
           </w:p>
         </w:tc>
@@ -1235,7 +1447,7 @@
                 <w:sz w:val="18"/>
                 <w:szCs w:val="18"/>
               </w:rPr>
-              <w:t xml:space="preserve">Stammgruppen à 4, Kartensatz A–D verteilen, Lösung bleibt geknickt.</w:t>
+              <w:t xml:space="preserve">Stammgruppen à 4, Anfragekarten A–D verteilen.</w:t>
             </w:r>
           </w:p>
         </w:tc>
@@ -1328,7 +1540,7 @@
                 <w:sz w:val="18"/>
                 <w:szCs w:val="18"/>
               </w:rPr>
-              <w:t xml:space="preserve">8–14</w:t>
+              <w:t xml:space="preserve">7–13</w:t>
             </w:r>
           </w:p>
         </w:tc>
@@ -1479,7 +1691,7 @@
                 <w:sz w:val="18"/>
                 <w:szCs w:val="18"/>
               </w:rPr>
-              <w:t xml:space="preserve">14–20</w:t>
+              <w:t xml:space="preserve">13–19</w:t>
             </w:r>
           </w:p>
         </w:tc>
@@ -1537,7 +1749,7 @@
                 <w:sz w:val="18"/>
                 <w:szCs w:val="18"/>
               </w:rPr>
-              <w:t xml:space="preserve">Gleiche Buchstaben zusammen (max. 4), vergleichen, Lösung aufklappen, verbessern.</w:t>
+              <w:t xml:space="preserve">Gleiche Buchstaben zusammen (max. 4), vergleichen. Antworten am Pult vorzeigen, dann gibt es die Lösungskarte. Verbessern.</w:t>
             </w:r>
           </w:p>
         </w:tc>
@@ -1630,7 +1842,7 @@
                 <w:sz w:val="18"/>
                 <w:szCs w:val="18"/>
               </w:rPr>
-              <w:t xml:space="preserve">20–32</w:t>
+              <w:t xml:space="preserve">19–29</w:t>
             </w:r>
           </w:p>
         </w:tc>
@@ -1688,7 +1900,7 @@
                 <w:sz w:val="18"/>
                 <w:szCs w:val="18"/>
               </w:rPr>
-              <w:t xml:space="preserve">Jeder Experte stellt seine Anfrage, die anderen beantworten sie mit dem Schaubild, der Experte prüft und ergänzt. Alle notieren je einen Satz in der Tabelle.</w:t>
+              <w:t xml:space="preserve">Jeder Experte stellt seine Anfrage, die anderen beantworten sie mit dem Schaubild, der Experte prüft und ergänzt (je ca. 2½ Min.). Alle notieren je einen Satz in der Tabelle.</w:t>
             </w:r>
           </w:p>
         </w:tc>
@@ -1781,7 +1993,7 @@
                 <w:sz w:val="18"/>
                 <w:szCs w:val="18"/>
               </w:rPr>
-              <w:t xml:space="preserve">32–39</w:t>
+              <w:t xml:space="preserve">29–35</w:t>
             </w:r>
           </w:p>
         </w:tc>
@@ -1810,7 +2022,7 @@
                 <w:sz w:val="18"/>
                 <w:szCs w:val="18"/>
               </w:rPr>
-              <w:t xml:space="preserve">Aha 2: Demokratie?</w:t>
+              <w:t xml:space="preserve">Sicherung: stummes Schaubild</w:t>
             </w:r>
           </w:p>
         </w:tc>
@@ -1839,7 +2051,7 @@
                 <w:sz w:val="18"/>
                 <w:szCs w:val="18"/>
               </w:rPr>
-              <w:t xml:space="preserve">Daumenabfrage (Erwartung: Nein). Paare ordnen sechs Merkmale den Spalten „demokratisch“ und „timokratisch“ zu. Auflösung: beides.</w:t>
+              <w:t xml:space="preserve">Buch und Heft zu. Allein Kästen beschriften, Pfeile 1–5 erklären, Lykons Rechte markieren. Selbstkontrolle an der Lösungsfolie, Fehler farbig markieren.</w:t>
             </w:r>
           </w:p>
         </w:tc>
@@ -1868,7 +2080,7 @@
                 <w:sz w:val="18"/>
                 <w:szCs w:val="18"/>
               </w:rPr>
-              <w:t xml:space="preserve">Plenum, PA</w:t>
+              <w:t xml:space="preserve">EA</w:t>
             </w:r>
           </w:p>
         </w:tc>
@@ -1897,7 +2109,7 @@
                 <w:sz w:val="18"/>
                 <w:szCs w:val="18"/>
               </w:rPr>
-              <w:t xml:space="preserve">11–13</w:t>
+              <w:t xml:space="preserve">11–12</w:t>
             </w:r>
           </w:p>
         </w:tc>
@@ -1932,7 +2144,7 @@
                 <w:sz w:val="18"/>
                 <w:szCs w:val="18"/>
               </w:rPr>
-              <w:t xml:space="preserve">39–45</w:t>
+              <w:t xml:space="preserve">35–42</w:t>
             </w:r>
           </w:p>
         </w:tc>
@@ -1961,6 +2173,157 @@
                 <w:sz w:val="18"/>
                 <w:szCs w:val="18"/>
               </w:rPr>
+              <w:t xml:space="preserve">Aha 2: Demokratie?</w:t>
+            </w:r>
+          </w:p>
+        </w:tc>
+        <w:tc>
+          <w:tcPr>
+            <w:tcW w:type="dxa" w:w="4188"/>
+            <w:tcBorders>
+              <w:top w:val="single" w:color="BFB5A5" w:sz="4"/>
+              <w:left w:val="single" w:color="BFB5A5" w:sz="4"/>
+              <w:bottom w:val="single" w:color="BFB5A5" w:sz="4"/>
+              <w:right w:val="single" w:color="BFB5A5" w:sz="4"/>
+            </w:tcBorders>
+            <w:tcMar>
+              <w:top w:type="dxa" w:w="70"/>
+              <w:left w:type="dxa" w:w="100"/>
+              <w:bottom w:type="dxa" w:w="70"/>
+              <w:right w:type="dxa" w:w="100"/>
+            </w:tcMar>
+          </w:tcPr>
+          <w:p>
+            <w:pPr>
+              <w:spacing w:after="0" w:before="0"/>
+            </w:pPr>
+            <w:r>
+              <w:rPr>
+                <w:sz w:val="18"/>
+                <w:szCs w:val="18"/>
+              </w:rPr>
+              <w:t xml:space="preserve">Daumenabfrage (Erwartung: Nein). Paare ordnen sechs Merkmale den Spalten „demokratisch“ und „timokratisch“ zu. Auflösung: beides.</w:t>
+            </w:r>
+          </w:p>
+        </w:tc>
+        <w:tc>
+          <w:tcPr>
+            <w:tcW w:type="dxa" w:w="1450"/>
+            <w:tcBorders>
+              <w:top w:val="single" w:color="BFB5A5" w:sz="4"/>
+              <w:left w:val="single" w:color="BFB5A5" w:sz="4"/>
+              <w:bottom w:val="single" w:color="BFB5A5" w:sz="4"/>
+              <w:right w:val="single" w:color="BFB5A5" w:sz="4"/>
+            </w:tcBorders>
+            <w:tcMar>
+              <w:top w:type="dxa" w:w="70"/>
+              <w:left w:type="dxa" w:w="100"/>
+              <w:bottom w:type="dxa" w:w="70"/>
+              <w:right w:type="dxa" w:w="100"/>
+            </w:tcMar>
+          </w:tcPr>
+          <w:p>
+            <w:pPr>
+              <w:spacing w:after="0" w:before="0"/>
+            </w:pPr>
+            <w:r>
+              <w:rPr>
+                <w:sz w:val="18"/>
+                <w:szCs w:val="18"/>
+              </w:rPr>
+              <w:t xml:space="preserve">Plenum, PA</w:t>
+            </w:r>
+          </w:p>
+        </w:tc>
+        <w:tc>
+          <w:tcPr>
+            <w:tcW w:type="dxa" w:w="1500"/>
+            <w:tcBorders>
+              <w:top w:val="single" w:color="BFB5A5" w:sz="4"/>
+              <w:left w:val="single" w:color="BFB5A5" w:sz="4"/>
+              <w:bottom w:val="single" w:color="BFB5A5" w:sz="4"/>
+              <w:right w:val="single" w:color="BFB5A5" w:sz="4"/>
+            </w:tcBorders>
+            <w:tcMar>
+              <w:top w:type="dxa" w:w="70"/>
+              <w:left w:type="dxa" w:w="100"/>
+              <w:bottom w:type="dxa" w:w="70"/>
+              <w:right w:type="dxa" w:w="100"/>
+            </w:tcMar>
+          </w:tcPr>
+          <w:p>
+            <w:pPr>
+              <w:spacing w:after="0" w:before="0"/>
+            </w:pPr>
+            <w:r>
+              <w:rPr>
+                <w:sz w:val="18"/>
+                <w:szCs w:val="18"/>
+              </w:rPr>
+              <w:t xml:space="preserve">13–15</w:t>
+            </w:r>
+          </w:p>
+        </w:tc>
+      </w:tr>
+      <w:tr>
+        <w:trPr>
+          <w:cantSplit/>
+        </w:trPr>
+        <w:tc>
+          <w:tcPr>
+            <w:tcW w:type="dxa" w:w="850"/>
+            <w:tcBorders>
+              <w:top w:val="single" w:color="BFB5A5" w:sz="4"/>
+              <w:left w:val="single" w:color="BFB5A5" w:sz="4"/>
+              <w:bottom w:val="single" w:color="BFB5A5" w:sz="4"/>
+              <w:right w:val="single" w:color="BFB5A5" w:sz="4"/>
+            </w:tcBorders>
+            <w:shd w:fill="F4ECDE" w:color="auto" w:val="clear"/>
+            <w:tcMar>
+              <w:top w:type="dxa" w:w="70"/>
+              <w:left w:type="dxa" w:w="100"/>
+              <w:bottom w:type="dxa" w:w="70"/>
+              <w:right w:type="dxa" w:w="100"/>
+            </w:tcMar>
+          </w:tcPr>
+          <w:p>
+            <w:pPr>
+              <w:spacing w:after="0" w:before="0"/>
+            </w:pPr>
+            <w:r>
+              <w:rPr>
+                <w:sz w:val="18"/>
+                <w:szCs w:val="18"/>
+              </w:rPr>
+              <w:t xml:space="preserve">42–45</w:t>
+            </w:r>
+          </w:p>
+        </w:tc>
+        <w:tc>
+          <w:tcPr>
+            <w:tcW w:type="dxa" w:w="1650"/>
+            <w:tcBorders>
+              <w:top w:val="single" w:color="BFB5A5" w:sz="4"/>
+              <w:left w:val="single" w:color="BFB5A5" w:sz="4"/>
+              <w:bottom w:val="single" w:color="BFB5A5" w:sz="4"/>
+              <w:right w:val="single" w:color="BFB5A5" w:sz="4"/>
+            </w:tcBorders>
+            <w:tcMar>
+              <w:top w:type="dxa" w:w="70"/>
+              <w:left w:type="dxa" w:w="100"/>
+              <w:bottom w:type="dxa" w:w="70"/>
+              <w:right w:type="dxa" w:w="100"/>
+            </w:tcMar>
+          </w:tcPr>
+          <w:p>
+            <w:pPr>
+              <w:spacing w:after="0" w:before="0"/>
+            </w:pPr>
+            <w:r>
+              <w:rPr>
+                <w:sz w:val="18"/>
+                <w:szCs w:val="18"/>
+              </w:rPr>
               <w:t xml:space="preserve">Urteil</w:t>
             </w:r>
           </w:p>
@@ -1990,7 +2353,7 @@
                 <w:sz w:val="18"/>
                 <w:szCs w:val="18"/>
               </w:rPr>
-              <w:t xml:space="preserve">Sachurteil: eher demokratisch oder timokratisch? Werturteil: Ist es gerecht, dass die Ämter vom Besitz abhängen? (Maßstab 1–4)</w:t>
+              <w:t xml:space="preserve">Sachurteil in der Stunde: eher demokratisch oder timokratisch? Werturteil als Hausaufgabe: Ist es gerecht, dass die Ämter vom Besitz abhängen? (Maßstab 1–4)</w:t>
             </w:r>
           </w:p>
         </w:tc>
@@ -2048,7 +2411,7 @@
                 <w:sz w:val="18"/>
                 <w:szCs w:val="18"/>
               </w:rPr>
-              <w:t xml:space="preserve">14–15</w:t>
+              <w:t xml:space="preserve">16–17</w:t>
             </w:r>
           </w:p>
         </w:tc>
@@ -2064,7 +2427,7 @@
           <w:sz w:val="18"/>
           <w:szCs w:val="18"/>
         </w:rPr>
-        <w:t xml:space="preserve">Folie 16 (Ausblick) leitet zur nächsten Stunde über: Gewinner-Verlierer-Linie als Einstieg, dann Peisistratos.</w:t>
+        <w:t xml:space="preserve">Folie 18 (Ausblick) leitet zur nächsten Stunde über: Gewinner-Verlierer-Linie als Einstieg, dann Peisistratos.</w:t>
       </w:r>
     </w:p>
     <w:p>
@@ -2102,7 +2465,7 @@
           <w:sz w:val="19"/>
           <w:szCs w:val="19"/>
         </w:rPr>
-        <w:t xml:space="preserve"> Du sprichst nur an den Übergängen. Die Kontrolle übernehmen die Faltkarten (Expertengruppe) und die Experten selbst (Stammgruppe). Folie 10 dient der Selbstkontrolle und wird nicht im Plenum besprochen.</w:t>
+        <w:t xml:space="preserve"> Du sprichst nur an den Übergängen. Die Lösungskarten gibst du nur gegen Vorzeigen der schriftlichen Antworten heraus – so wird erst gedacht, dann verglichen, und du siehst nebenbei, wo die Gruppen stehen. Folie 10 dient der Selbstkontrolle und wird nicht im Plenum besprochen.</w:t>
       </w:r>
     </w:p>
     <w:p>
@@ -2116,14 +2479,14 @@
           <w:sz w:val="19"/>
           <w:szCs w:val="19"/>
         </w:rPr>
-        <w:t xml:space="preserve">Aha 1:</w:t>
+        <w:t xml:space="preserve">Sicherung:</w:t>
       </w:r>
       <w:r>
         <w:rPr>
           <w:sz w:val="19"/>
           <w:szCs w:val="19"/>
         </w:rPr>
-        <w:t xml:space="preserve"> Vor der Auflösung nicht kommentieren. Die Verteilung an der Tafel festzuhalten, macht den Überraschungseffekt sichtbar. Megakles hat mit 150 Scheffeln weniger als 200 und gehört deshalb zu den Theten.</w:t>
+        <w:t xml:space="preserve"> Das stumme Schaubild ist bewusst anders angeordnet als im Buch (Klassen links, Volksversammlung rechts). Wer nur ein Bild im Kopf hat, kommt nicht weit; Aufgabe 3 (Lykons Rechte) lässt sich nur mit Verständnis lösen. Das Blatt kommt ins Heft – eingesammelt zeigt es dir, wer das Schaubild verstanden hat.</w:t>
       </w:r>
     </w:p>
     <w:p>
@@ -2137,14 +2500,14 @@
           <w:sz w:val="19"/>
           <w:szCs w:val="19"/>
         </w:rPr>
-        <w:t xml:space="preserve">Gruppenpuzzle:</w:t>
+        <w:t xml:space="preserve">Aha 1:</w:t>
       </w:r>
       <w:r>
         <w:rPr>
           <w:sz w:val="19"/>
           <w:szCs w:val="19"/>
         </w:rPr>
-        <w:t xml:space="preserve"> Häufigste Lücke in Schritt 1 ist, dass nur ein Organ genannt wird. Nachfrage: „Wer ist noch beteiligt?“ Ein Zeitsignal nach jeder Anfrage in Schritt 3 hilft (ca. 3 Min. pro Anfrage).</w:t>
+        <w:t xml:space="preserve"> Vor der Auflösung nicht kommentieren. Die Verteilung an der Tafel festzuhalten, macht den Überraschungseffekt sichtbar. Megakles hat mit 150 Scheffeln weniger als 200 und gehört deshalb zu den Theten.</w:t>
       </w:r>
     </w:p>
     <w:p>
@@ -2158,14 +2521,35 @@
           <w:sz w:val="19"/>
           <w:szCs w:val="19"/>
         </w:rPr>
-        <w:t xml:space="preserve">Aha 2:</w:t>
+        <w:t xml:space="preserve">Gruppenpuzzle:</w:t>
       </w:r>
       <w:r>
         <w:rPr>
           <w:sz w:val="19"/>
           <w:szCs w:val="19"/>
         </w:rPr>
-        <w:t xml:space="preserve"> Die Schlussfrage auf Folie 13 („Was müsste sich ändern, damit Athen eine Demokratie wird?“) nicht beantworten. Sie führt später zu Kleisthenes.</w:t>
+        <w:t xml:space="preserve"> Häufigste Lücke in Schritt 1 ist, dass nur ein Organ genannt wird. Nachfrage: „Wer ist noch beteiligt?“ Ein Zeitsignal nach jeder Anfrage in Schritt 3 hilft (ca. 3 Min. pro Anfrage).</w:t>
+      </w:r>
+    </w:p>
+    <w:p>
+      <w:pPr>
+        <w:spacing w:after="80" w:before="0"/>
+      </w:pPr>
+      <w:r>
+        <w:rPr>
+          <w:b/>
+          <w:bCs/>
+          <w:sz w:val="19"/>
+          <w:szCs w:val="19"/>
+        </w:rPr>
+        <w:t xml:space="preserve">Aha 2:</w:t>
+      </w:r>
+      <w:r>
+        <w:rPr>
+          <w:sz w:val="19"/>
+          <w:szCs w:val="19"/>
+        </w:rPr>
+        <w:t xml:space="preserve"> Die Schlussfrage auf Folie 15 („Was müsste sich ändern, damit Athen eine Demokratie wird?“) nicht beantworten. Sie führt später zu Kleisthenes.</w:t>
       </w:r>
     </w:p>
     <w:p>
@@ -2824,7 +3208,7 @@
           <w:sz w:val="20"/>
           <w:szCs w:val="20"/>
         </w:rPr>
-        <w:t xml:space="preserve">–  Das Werturteil als Hausaufgabe.</w:t>
+        <w:t xml:space="preserve">–  Aha 2 kürzen: nur Daumenabfrage und Auflösungsfolie, ohne Sortieren.</w:t>
       </w:r>
     </w:p>
     <w:sectPr>

</xml_diff>